<commit_message>
Change 5: Stronger Nonprofits Capacity Grants: award range changed from $5,000–$20,000 to $7,500–$25,000.
Independent test branch created directly from BASELINE v1-original
(a5b0342). Contains this change only.

Co-Authored-By: Claude Opus 5.5 <noreply@anthropic.com>
Claude-Session: https://claude.ai/code/session_01CQxLpwe1Pu1FJJBAM5jt5M
</commit_message>
<xml_diff>
--- a/documents-src/guidelines/cpcf-stronger-nonprofits-capacity-grants-2027-rfp.docx
+++ b/documents-src/guidelines/cpcf-stronger-nonprofits-capacity-grants-2027-rfp.docx
@@ -59,7 +59,7 @@
           </w:p>
           <w:p>
             <w:r>
-              <w:t>Funding: $5,000 to $20,000</w:t>
+              <w:t>Funding: $7,500 to $25,000</w:t>
             </w:r>
           </w:p>
           <w:p>
@@ -348,7 +348,7 @@
         <w:rPr>
           <w:i w:val="0"/>
         </w:rPr>
-        <w:t>$5,000 to $20,000. Capacity-building project support.</w:t>
+        <w:t>$7,500 to $25,000. Capacity-building project support.</w:t>
       </w:r>
     </w:p>
     <w:p>

</xml_diff>